<commit_message>
Bổ sung sơ đồ và ảnh minh hoạ vào tài liệu thiết kế
Thêm 4 sơ đồ còn thiếu (phân quyền, ERD, luồng nhập/xuất kho) và 5 ảnh
chụp màn hình thật từ role Quản lý kho đã hiện thực (login, dashboard,
duyệt phiếu, danh mục, báo cáo), cùng mục liệt kê phần tài liệu còn
thiếu (use case, luồng 4 loại phiếu còn lại, ảnh Admin/Nhân viên kho...).
</commit_message>
<xml_diff>
--- a/He-thong-quan-ly-kho-do-kho-ngu-coc.docx
+++ b/He-thong-quan-ly-kho-do-kho-ngu-coc.docx
@@ -439,6 +439,57 @@
     </w:tbl>
     <w:p>
       <w:pPr>
+        <w:jc w:val="center"/>
+      </w:pPr>
+      <w:r>
+        <w:drawing>
+          <wp:inline xmlns:a="http://schemas.openxmlformats.org/drawingml/2006/main" xmlns:pic="http://schemas.openxmlformats.org/drawingml/2006/picture">
+            <wp:extent cx="3931920" cy="2663559"/>
+            <wp:docPr id="1" name="Picture 1"/>
+            <wp:cNvGraphicFramePr>
+              <a:graphicFrameLocks noChangeAspect="1"/>
+            </wp:cNvGraphicFramePr>
+            <a:graphic>
+              <a:graphicData uri="http://schemas.openxmlformats.org/drawingml/2006/picture">
+                <pic:pic>
+                  <pic:nvPicPr>
+                    <pic:cNvPr id="0" name="roles.png"/>
+                    <pic:cNvPicPr/>
+                  </pic:nvPicPr>
+                  <pic:blipFill>
+                    <a:blip r:embed="rId8"/>
+                    <a:stretch>
+                      <a:fillRect/>
+                    </a:stretch>
+                  </pic:blipFill>
+                  <pic:spPr>
+                    <a:xfrm>
+                      <a:off x="0" y="0"/>
+                      <a:ext cx="3931920" cy="2663559"/>
+                    </a:xfrm>
+                    <a:prstGeom prst="rect"/>
+                  </pic:spPr>
+                </pic:pic>
+              </a:graphicData>
+            </a:graphic>
+          </wp:inline>
+        </w:drawing>
+      </w:r>
+    </w:p>
+    <w:p>
+      <w:pPr>
+        <w:jc w:val="center"/>
+      </w:pPr>
+      <w:r>
+        <w:rPr>
+          <w:i/>
+          <w:sz w:val="19"/>
+        </w:rPr>
+        <w:t>Hình 1. Sơ đồ phân cấp 3 vai trò trong hệ thống.</w:t>
+      </w:r>
+    </w:p>
+    <w:p>
+      <w:pPr>
         <w:pStyle w:val="Heading1"/>
         <w:pBdr>
           <w:bottom w:val="single" w:color="1F4E79" w:sz="6" w:space="4"/>
@@ -5258,6 +5309,57 @@
     </w:tbl>
     <w:p>
       <w:pPr>
+        <w:jc w:val="center"/>
+      </w:pPr>
+      <w:r>
+        <w:drawing>
+          <wp:inline xmlns:a="http://schemas.openxmlformats.org/drawingml/2006/main" xmlns:pic="http://schemas.openxmlformats.org/drawingml/2006/picture">
+            <wp:extent cx="5760720" cy="3101926"/>
+            <wp:docPr id="2" name="Picture 2"/>
+            <wp:cNvGraphicFramePr>
+              <a:graphicFrameLocks noChangeAspect="1"/>
+            </wp:cNvGraphicFramePr>
+            <a:graphic>
+              <a:graphicData uri="http://schemas.openxmlformats.org/drawingml/2006/picture">
+                <pic:pic>
+                  <pic:nvPicPr>
+                    <pic:cNvPr id="0" name="erd.png"/>
+                    <pic:cNvPicPr/>
+                  </pic:nvPicPr>
+                  <pic:blipFill>
+                    <a:blip r:embed="rId9"/>
+                    <a:stretch>
+                      <a:fillRect/>
+                    </a:stretch>
+                  </pic:blipFill>
+                  <pic:spPr>
+                    <a:xfrm>
+                      <a:off x="0" y="0"/>
+                      <a:ext cx="5760720" cy="3101926"/>
+                    </a:xfrm>
+                    <a:prstGeom prst="rect"/>
+                  </pic:spPr>
+                </pic:pic>
+              </a:graphicData>
+            </a:graphic>
+          </wp:inline>
+        </w:drawing>
+      </w:r>
+    </w:p>
+    <w:p>
+      <w:pPr>
+        <w:jc w:val="center"/>
+      </w:pPr>
+      <w:r>
+        <w:rPr>
+          <w:i/>
+          <w:sz w:val="19"/>
+        </w:rPr>
+        <w:t>Hình 2. Sơ đồ quan hệ dữ liệu (ERD) giữa các bảng chính.</w:t>
+      </w:r>
+    </w:p>
+    <w:p>
+      <w:pPr>
         <w:pStyle w:val="Heading1"/>
         <w:pBdr>
           <w:bottom w:val="single" w:color="1F4E79" w:sz="6" w:space="4"/>
@@ -5477,6 +5579,57 @@
     </w:tbl>
     <w:p>
       <w:pPr>
+        <w:jc w:val="center"/>
+      </w:pPr>
+      <w:r>
+        <w:drawing>
+          <wp:inline xmlns:a="http://schemas.openxmlformats.org/drawingml/2006/main" xmlns:pic="http://schemas.openxmlformats.org/drawingml/2006/picture">
+            <wp:extent cx="5486400" cy="3816626"/>
+            <wp:docPr id="3" name="Picture 3"/>
+            <wp:cNvGraphicFramePr>
+              <a:graphicFrameLocks noChangeAspect="1"/>
+            </wp:cNvGraphicFramePr>
+            <a:graphic>
+              <a:graphicData uri="http://schemas.openxmlformats.org/drawingml/2006/picture">
+                <pic:pic>
+                  <pic:nvPicPr>
+                    <pic:cNvPr id="0" name="flow_inbound.png"/>
+                    <pic:cNvPicPr/>
+                  </pic:nvPicPr>
+                  <pic:blipFill>
+                    <a:blip r:embed="rId10"/>
+                    <a:stretch>
+                      <a:fillRect/>
+                    </a:stretch>
+                  </pic:blipFill>
+                  <pic:spPr>
+                    <a:xfrm>
+                      <a:off x="0" y="0"/>
+                      <a:ext cx="5486400" cy="3816626"/>
+                    </a:xfrm>
+                    <a:prstGeom prst="rect"/>
+                  </pic:spPr>
+                </pic:pic>
+              </a:graphicData>
+            </a:graphic>
+          </wp:inline>
+        </w:drawing>
+      </w:r>
+    </w:p>
+    <w:p>
+      <w:pPr>
+        <w:jc w:val="center"/>
+      </w:pPr>
+      <w:r>
+        <w:rPr>
+          <w:i/>
+          <w:sz w:val="19"/>
+        </w:rPr>
+        <w:t>Hình 3. Sơ đồ luồng xử lý Phiếu nhập kho.</w:t>
+      </w:r>
+    </w:p>
+    <w:p>
+      <w:pPr>
         <w:pStyle w:val="Heading2"/>
         <w:spacing w:after="150" w:before="300"/>
       </w:pPr>
@@ -5605,6 +5758,363 @@
         </w:tc>
       </w:tr>
     </w:tbl>
+    <w:p>
+      <w:pPr>
+        <w:jc w:val="center"/>
+      </w:pPr>
+      <w:r>
+        <w:drawing>
+          <wp:inline xmlns:a="http://schemas.openxmlformats.org/drawingml/2006/main" xmlns:pic="http://schemas.openxmlformats.org/drawingml/2006/picture">
+            <wp:extent cx="5486400" cy="4174435"/>
+            <wp:docPr id="4" name="Picture 4"/>
+            <wp:cNvGraphicFramePr>
+              <a:graphicFrameLocks noChangeAspect="1"/>
+            </wp:cNvGraphicFramePr>
+            <a:graphic>
+              <a:graphicData uri="http://schemas.openxmlformats.org/drawingml/2006/picture">
+                <pic:pic>
+                  <pic:nvPicPr>
+                    <pic:cNvPr id="0" name="flow_outbound.png"/>
+                    <pic:cNvPicPr/>
+                  </pic:nvPicPr>
+                  <pic:blipFill>
+                    <a:blip r:embed="rId11"/>
+                    <a:stretch>
+                      <a:fillRect/>
+                    </a:stretch>
+                  </pic:blipFill>
+                  <pic:spPr>
+                    <a:xfrm>
+                      <a:off x="0" y="0"/>
+                      <a:ext cx="5486400" cy="4174435"/>
+                    </a:xfrm>
+                    <a:prstGeom prst="rect"/>
+                  </pic:spPr>
+                </pic:pic>
+              </a:graphicData>
+            </a:graphic>
+          </wp:inline>
+        </w:drawing>
+      </w:r>
+    </w:p>
+    <w:p>
+      <w:pPr>
+        <w:jc w:val="center"/>
+      </w:pPr>
+      <w:r>
+        <w:rPr>
+          <w:i/>
+          <w:sz w:val="19"/>
+        </w:rPr>
+        <w:t>Hình 4. Sơ đồ luồng xử lý Phiếu xuất kho theo nguyên tắc FEFO.</w:t>
+      </w:r>
+    </w:p>
+    <w:p>
+      <w:pPr>
+        <w:pStyle w:val="Heading1"/>
+      </w:pPr>
+      <w:r>
+        <w:t>6. Giao diện demo — Vai trò Quản lý kho (đã hiện thực)</w:t>
+      </w:r>
+    </w:p>
+    <w:p>
+      <w:r>
+        <w:t>Các ảnh chụp màn hình dưới đây lấy từ bản build thật (flutter run -d chrome), minh hoạ phần vai trò Quản lý kho đã được hiện thực đầy đủ theo tài liệu thiết kế ở trên.</w:t>
+      </w:r>
+    </w:p>
+    <w:p>
+      <w:pPr>
+        <w:jc w:val="center"/>
+      </w:pPr>
+      <w:r>
+        <w:drawing>
+          <wp:inline xmlns:a="http://schemas.openxmlformats.org/drawingml/2006/main" xmlns:pic="http://schemas.openxmlformats.org/drawingml/2006/picture">
+            <wp:extent cx="3108960" cy="5829300"/>
+            <wp:docPr id="5" name="Picture 5"/>
+            <wp:cNvGraphicFramePr>
+              <a:graphicFrameLocks noChangeAspect="1"/>
+            </wp:cNvGraphicFramePr>
+            <a:graphic>
+              <a:graphicData uri="http://schemas.openxmlformats.org/drawingml/2006/picture">
+                <pic:pic>
+                  <pic:nvPicPr>
+                    <pic:cNvPr id="0" name="01_login.png"/>
+                    <pic:cNvPicPr/>
+                  </pic:nvPicPr>
+                  <pic:blipFill>
+                    <a:blip r:embed="rId12"/>
+                    <a:stretch>
+                      <a:fillRect/>
+                    </a:stretch>
+                  </pic:blipFill>
+                  <pic:spPr>
+                    <a:xfrm>
+                      <a:off x="0" y="0"/>
+                      <a:ext cx="3108960" cy="5829300"/>
+                    </a:xfrm>
+                    <a:prstGeom prst="rect"/>
+                  </pic:spPr>
+                </pic:pic>
+              </a:graphicData>
+            </a:graphic>
+          </wp:inline>
+        </w:drawing>
+      </w:r>
+    </w:p>
+    <w:p>
+      <w:pPr>
+        <w:jc w:val="center"/>
+      </w:pPr>
+      <w:r>
+        <w:rPr>
+          <w:i/>
+          <w:sz w:val="19"/>
+        </w:rPr>
+        <w:t>Hình 5. Màn hình Đăng nhập (email + mật khẩu, không có đăng ký).</w:t>
+      </w:r>
+    </w:p>
+    <w:p>
+      <w:pPr>
+        <w:jc w:val="center"/>
+      </w:pPr>
+      <w:r>
+        <w:drawing>
+          <wp:inline xmlns:a="http://schemas.openxmlformats.org/drawingml/2006/main" xmlns:pic="http://schemas.openxmlformats.org/drawingml/2006/picture">
+            <wp:extent cx="3108960" cy="5829300"/>
+            <wp:docPr id="6" name="Picture 6"/>
+            <wp:cNvGraphicFramePr>
+              <a:graphicFrameLocks noChangeAspect="1"/>
+            </wp:cNvGraphicFramePr>
+            <a:graphic>
+              <a:graphicData uri="http://schemas.openxmlformats.org/drawingml/2006/picture">
+                <pic:pic>
+                  <pic:nvPicPr>
+                    <pic:cNvPr id="0" name="03_manager_dashboard.png"/>
+                    <pic:cNvPicPr/>
+                  </pic:nvPicPr>
+                  <pic:blipFill>
+                    <a:blip r:embed="rId13"/>
+                    <a:stretch>
+                      <a:fillRect/>
+                    </a:stretch>
+                  </pic:blipFill>
+                  <pic:spPr>
+                    <a:xfrm>
+                      <a:off x="0" y="0"/>
+                      <a:ext cx="3108960" cy="5829300"/>
+                    </a:xfrm>
+                    <a:prstGeom prst="rect"/>
+                  </pic:spPr>
+                </pic:pic>
+              </a:graphicData>
+            </a:graphic>
+          </wp:inline>
+        </w:drawing>
+      </w:r>
+    </w:p>
+    <w:p>
+      <w:pPr>
+        <w:jc w:val="center"/>
+      </w:pPr>
+      <w:r>
+        <w:rPr>
+          <w:i/>
+          <w:sz w:val="19"/>
+        </w:rPr>
+        <w:t>Hình 6. Dashboard Quản lý kho — tổng quan, tồn kho thấp, sắp hết hạn.</w:t>
+      </w:r>
+    </w:p>
+    <w:p>
+      <w:pPr>
+        <w:jc w:val="center"/>
+      </w:pPr>
+      <w:r>
+        <w:drawing>
+          <wp:inline xmlns:a="http://schemas.openxmlformats.org/drawingml/2006/main" xmlns:pic="http://schemas.openxmlformats.org/drawingml/2006/picture">
+            <wp:extent cx="3108960" cy="5829300"/>
+            <wp:docPr id="7" name="Picture 7"/>
+            <wp:cNvGraphicFramePr>
+              <a:graphicFrameLocks noChangeAspect="1"/>
+            </wp:cNvGraphicFramePr>
+            <a:graphic>
+              <a:graphicData uri="http://schemas.openxmlformats.org/drawingml/2006/picture">
+                <pic:pic>
+                  <pic:nvPicPr>
+                    <pic:cNvPr id="0" name="04_manager_approvals.png"/>
+                    <pic:cNvPicPr/>
+                  </pic:nvPicPr>
+                  <pic:blipFill>
+                    <a:blip r:embed="rId14"/>
+                    <a:stretch>
+                      <a:fillRect/>
+                    </a:stretch>
+                  </pic:blipFill>
+                  <pic:spPr>
+                    <a:xfrm>
+                      <a:off x="0" y="0"/>
+                      <a:ext cx="3108960" cy="5829300"/>
+                    </a:xfrm>
+                    <a:prstGeom prst="rect"/>
+                  </pic:spPr>
+                </pic:pic>
+              </a:graphicData>
+            </a:graphic>
+          </wp:inline>
+        </w:drawing>
+      </w:r>
+    </w:p>
+    <w:p>
+      <w:pPr>
+        <w:jc w:val="center"/>
+      </w:pPr>
+      <w:r>
+        <w:rPr>
+          <w:i/>
+          <w:sz w:val="19"/>
+        </w:rPr>
+        <w:t>Hình 7. Tab Duyệt phiếu — 6 loại chứng từ, hiển thị số phiếu chờ duyệt.</w:t>
+      </w:r>
+    </w:p>
+    <w:p>
+      <w:pPr>
+        <w:jc w:val="center"/>
+      </w:pPr>
+      <w:r>
+        <w:drawing>
+          <wp:inline xmlns:a="http://schemas.openxmlformats.org/drawingml/2006/main" xmlns:pic="http://schemas.openxmlformats.org/drawingml/2006/picture">
+            <wp:extent cx="3108960" cy="5829300"/>
+            <wp:docPr id="8" name="Picture 8"/>
+            <wp:cNvGraphicFramePr>
+              <a:graphicFrameLocks noChangeAspect="1"/>
+            </wp:cNvGraphicFramePr>
+            <a:graphic>
+              <a:graphicData uri="http://schemas.openxmlformats.org/drawingml/2006/picture">
+                <pic:pic>
+                  <pic:nvPicPr>
+                    <pic:cNvPr id="0" name="05_manager_catalog.png"/>
+                    <pic:cNvPicPr/>
+                  </pic:nvPicPr>
+                  <pic:blipFill>
+                    <a:blip r:embed="rId15"/>
+                    <a:stretch>
+                      <a:fillRect/>
+                    </a:stretch>
+                  </pic:blipFill>
+                  <pic:spPr>
+                    <a:xfrm>
+                      <a:off x="0" y="0"/>
+                      <a:ext cx="3108960" cy="5829300"/>
+                    </a:xfrm>
+                    <a:prstGeom prst="rect"/>
+                  </pic:spPr>
+                </pic:pic>
+              </a:graphicData>
+            </a:graphic>
+          </wp:inline>
+        </w:drawing>
+      </w:r>
+    </w:p>
+    <w:p>
+      <w:pPr>
+        <w:jc w:val="center"/>
+      </w:pPr>
+      <w:r>
+        <w:rPr>
+          <w:i/>
+          <w:sz w:val="19"/>
+        </w:rPr>
+        <w:t>Hình 8. Tab Danh mục — Nhà cung cấp, Sản phẩm, Đơn vị tính.</w:t>
+      </w:r>
+    </w:p>
+    <w:p>
+      <w:pPr>
+        <w:jc w:val="center"/>
+      </w:pPr>
+      <w:r>
+        <w:drawing>
+          <wp:inline xmlns:a="http://schemas.openxmlformats.org/drawingml/2006/main" xmlns:pic="http://schemas.openxmlformats.org/drawingml/2006/picture">
+            <wp:extent cx="3108960" cy="5829300"/>
+            <wp:docPr id="9" name="Picture 9"/>
+            <wp:cNvGraphicFramePr>
+              <a:graphicFrameLocks noChangeAspect="1"/>
+            </wp:cNvGraphicFramePr>
+            <a:graphic>
+              <a:graphicData uri="http://schemas.openxmlformats.org/drawingml/2006/picture">
+                <pic:pic>
+                  <pic:nvPicPr>
+                    <pic:cNvPr id="0" name="06_manager_reports.png"/>
+                    <pic:cNvPicPr/>
+                  </pic:nvPicPr>
+                  <pic:blipFill>
+                    <a:blip r:embed="rId16"/>
+                    <a:stretch>
+                      <a:fillRect/>
+                    </a:stretch>
+                  </pic:blipFill>
+                  <pic:spPr>
+                    <a:xfrm>
+                      <a:off x="0" y="0"/>
+                      <a:ext cx="3108960" cy="5829300"/>
+                    </a:xfrm>
+                    <a:prstGeom prst="rect"/>
+                  </pic:spPr>
+                </pic:pic>
+              </a:graphicData>
+            </a:graphic>
+          </wp:inline>
+        </w:drawing>
+      </w:r>
+    </w:p>
+    <w:p>
+      <w:pPr>
+        <w:jc w:val="center"/>
+      </w:pPr>
+      <w:r>
+        <w:rPr>
+          <w:i/>
+          <w:sz w:val="19"/>
+        </w:rPr>
+        <w:t>Hình 9. Tab Báo cáo &amp; Nhật ký — tồn theo lô, hao hụt, audit log.</w:t>
+      </w:r>
+    </w:p>
+    <w:p>
+      <w:pPr>
+        <w:pStyle w:val="Heading1"/>
+      </w:pPr>
+      <w:r>
+        <w:t>7. Phần còn thiếu trong tài liệu này</w:t>
+      </w:r>
+    </w:p>
+    <w:p>
+      <w:r>
+        <w:t>-  Sơ đồ Use Case tổng quát cho cả 3 vai trò (tài liệu mới có ma trận phân quyền dạng bảng, chưa có Use Case Diagram theo chuẩn UML).</w:t>
+      </w:r>
+    </w:p>
+    <w:p>
+      <w:r>
+        <w:t>-  Sơ đồ luồng nghiệp vụ cho 4 loại chứng từ còn lại: Phiếu kiểm kê, Phiếu điều chỉnh tồn, Phiếu trả hàng NCC, Phiếu hàng hỏng/hết hạn (mới có 2 luồng Nhập/Xuất ở mục 5).</w:t>
+      </w:r>
+    </w:p>
+    <w:p>
+      <w:r>
+        <w:t>-  Ảnh chụp giao diện cho vai trò Admin và Nhân viên kho (tài liệu này chỉ bổ sung ảnh cho vai trò Quản lý kho — phần mình phụ trách).</w:t>
+      </w:r>
+    </w:p>
+    <w:p>
+      <w:r>
+        <w:t>-  Sơ đồ kiến trúc kỹ thuật (Architecture diagram): Flutter UI → Provider (AuthStore/WarehouseStore) → SharedPreferences, hiện chỉ mô tả bằng chữ trong README.</w:t>
+      </w:r>
+    </w:p>
+    <w:p>
+      <w:r>
+        <w:t>-  Wireframe/mockup thiết kế trước khi code (hiện đi thẳng từ mô tả chữ sang code, không có bản phác thảo UI riêng).</w:t>
+      </w:r>
+    </w:p>
+    <w:p>
+      <w:r>
+        <w:t>-  Mục Kết luận / Hướng phát triển tiếp theo (kết nối backend thật, quét mã QR/Barcode thật, xuất báo cáo Excel/PDF).</w:t>
+      </w:r>
+    </w:p>
     <w:sectPr>
       <w:pgSz w:w="11907" w:h="16840" w:orient="portrait"/>
       <w:pgMar w:top="1000" w:right="1100" w:bottom="1000" w:left="1100" w:header="708" w:footer="708" w:gutter="0"/>

</xml_diff>